<commit_message>
fix(certificados): corregir titulo de capitulo en editorial extranjera y fijar firma del Vicerrector Luis Ortiz
</commit_message>
<xml_diff>
--- a/Certificados/Avales/Editorial-Extranjera/Aval-Capítulo-Editorial extranjera.docx
+++ b/Certificados/Avales/Editorial-Extranjera/Aval-Capítulo-Editorial extranjera.docx
@@ -869,7 +869,7 @@
           <w:sz w:val="22"/>
           <w:szCs w:val="22"/>
         </w:rPr>
-        <w:t>xxxx</w:t>
+        <w:t>{dia_expedicion}</w:t>
       </w:r>
       <w:proofErr w:type="spellEnd"/>
       <w:r>
@@ -887,7 +887,7 @@
           <w:sz w:val="22"/>
           <w:szCs w:val="22"/>
         </w:rPr>
-        <w:t>xxxxx</w:t>
+        <w:t>{mes_expedicion}</w:t>
       </w:r>
       <w:proofErr w:type="spellEnd"/>
       <w:r>

</xml_diff>

<commit_message>
feat(certificados): integrar MEMBRETE USB, titulo EDITORIAL EXTERNA, anio de publicacion y tabla institucional
</commit_message>
<xml_diff>
--- a/Certificados/Avales/Editorial-Extranjera/Aval-Capítulo-Editorial extranjera.docx
+++ b/Certificados/Avales/Editorial-Extranjera/Aval-Capítulo-Editorial extranjera.docx
@@ -89,7 +89,7 @@
           <w:b/>
           <w:bCs/>
         </w:rPr>
-        <w:t>POR EDITORIAL EXTRANJERA</w:t>
+        <w:t>POR EDITORIAL EXTERNA</w:t>
       </w:r>
     </w:p>
     <w:p>
@@ -115,77 +115,100 @@
     <w:p>
       <w:pPr>
         <w:jc w:val="center"/>
-        <w:rPr>
-          <w:rFonts w:ascii="Roboto" w:hAnsi="Roboto"/>
-          <w:sz w:val="22"/>
-          <w:szCs w:val="22"/>
-        </w:rPr>
-      </w:pPr>
-      <w:r>
-        <w:rPr>
-          <w:rFonts w:ascii="Roboto" w:hAnsi="Roboto"/>
-          <w:sz w:val="22"/>
-          <w:szCs w:val="22"/>
-        </w:rPr>
-        <w:t xml:space="preserve">El suscrito </w:t>
-      </w:r>
-      <w:proofErr w:type="gramStart"/>
-      <w:r>
-        <w:rPr>
-          <w:rFonts w:ascii="Roboto" w:hAnsi="Roboto"/>
-          <w:sz w:val="22"/>
-          <w:szCs w:val="22"/>
-        </w:rPr>
-        <w:t>Director</w:t>
-      </w:r>
-      <w:proofErr w:type="gramEnd"/>
-      <w:r>
-        <w:rPr>
-          <w:rFonts w:ascii="Roboto" w:hAnsi="Roboto"/>
-          <w:sz w:val="22"/>
-          <w:szCs w:val="22"/>
-        </w:rPr>
-        <w:t xml:space="preserve"> </w:t>
-      </w:r>
-      <w:r>
-        <w:rPr>
-          <w:rFonts w:ascii="Roboto" w:hAnsi="Roboto"/>
-          <w:sz w:val="22"/>
-          <w:szCs w:val="22"/>
-        </w:rPr>
-        <w:t xml:space="preserve">de </w:t>
-      </w:r>
-      <w:r>
-        <w:rPr>
-          <w:rFonts w:ascii="Roboto" w:hAnsi="Roboto"/>
-          <w:sz w:val="22"/>
-          <w:szCs w:val="22"/>
-        </w:rPr>
-        <w:t>Conocimiento</w:t>
-      </w:r>
-      <w:r>
-        <w:rPr>
-          <w:rFonts w:ascii="Roboto" w:hAnsi="Roboto"/>
-          <w:sz w:val="22"/>
-          <w:szCs w:val="22"/>
-        </w:rPr>
-        <w:t xml:space="preserve">, Innovación y </w:t>
-      </w:r>
-      <w:r>
-        <w:rPr>
-          <w:rFonts w:ascii="Roboto" w:hAnsi="Roboto"/>
-          <w:sz w:val="22"/>
-          <w:szCs w:val="22"/>
-        </w:rPr>
-        <w:t>Apropiación Social</w:t>
-      </w:r>
-      <w:r>
-        <w:rPr>
-          <w:rFonts w:ascii="Roboto" w:hAnsi="Roboto"/>
-          <w:sz w:val="22"/>
-          <w:szCs w:val="22"/>
-        </w:rPr>
-        <w:t xml:space="preserve"> de la Universidad Simón Bolívar</w:t>
+        <w:spacing w:before="240" w:after="200" w:line="276" w:lineRule="auto"/>
+        <w:rPr>
+          <w:rFonts w:ascii="Roboto" w:hAnsi="Roboto"/>
+          <w:sz w:val="22"/>
+          <w:szCs w:val="22"/>
+          <w:lang w:val="es-CO"/>
+        </w:rPr>
+      </w:pPr>
+      <w:r>
+        <w:rPr>
+          <w:rFonts w:ascii="Roboto" w:hAnsi="Roboto"/>
+          <w:sz w:val="22"/>
+          <w:szCs w:val="22"/>
+          <w:lang w:val="es-CO"/>
+        </w:rPr>
+        <w:t xml:space="preserve">El suscrito Vicerrector de Investigación, Extensión e Innovación de la Universidad Simón Bolívar, declara que:</w:t>
+      </w:r>
+    </w:p>
+    <w:p>
+      <w:pPr>
+        <w:jc w:val="both"/>
+        <w:rPr>
+          <w:rFonts w:ascii="Roboto" w:hAnsi="Roboto"/>
+          <w:sz w:val="22"/>
+          <w:szCs w:val="22"/>
+        </w:rPr>
+      </w:pPr>
+    </w:p>
+    <w:p>
+      <w:pPr>
+        <w:jc w:val="both"/>
+        <w:rPr>
+          <w:rFonts w:ascii="Roboto" w:hAnsi="Roboto"/>
+          <w:sz w:val="22"/>
+          <w:szCs w:val="22"/>
+        </w:rPr>
+      </w:pPr>
+    </w:p>
+    <w:p>
+      <w:pPr>
+        <w:jc w:val="both"/>
+        <w:rPr>
+          <w:rFonts w:ascii="Roboto" w:hAnsi="Roboto"/>
+          <w:sz w:val="22"/>
+          <w:szCs w:val="22"/>
+        </w:rPr>
+      </w:pPr>
+      <w:r>
+        <w:rPr>
+          <w:rFonts w:ascii="Roboto" w:hAnsi="Roboto"/>
+          <w:sz w:val="22"/>
+          <w:szCs w:val="22"/>
+        </w:rPr>
+        <w:t xml:space="preserve">Una vez verificado el cumplimiento de los criterios descritos en </w:t>
+      </w:r>
+      <w:r>
+        <w:rPr>
+          <w:rFonts w:ascii="Roboto" w:hAnsi="Roboto"/>
+          <w:sz w:val="22"/>
+          <w:szCs w:val="22"/>
+        </w:rPr>
+        <w:t xml:space="preserve">la Convocatoria Nacional de Actualización y Transición para el Reconocimiento y Medición de Grupos de Investigación, Desarrollo Tecnológico o de Innovación y para el Reconocimiento de Investigadores del Sistema Nacional </w:t>
+      </w:r>
+      <w:r>
+        <w:rPr>
+          <w:rFonts w:ascii="Roboto" w:hAnsi="Roboto"/>
+          <w:sz w:val="22"/>
+          <w:szCs w:val="22"/>
+        </w:rPr>
+        <w:t>d</w:t>
+      </w:r>
+      <w:r>
+        <w:rPr>
+          <w:rFonts w:ascii="Roboto" w:hAnsi="Roboto"/>
+          <w:sz w:val="22"/>
+          <w:szCs w:val="22"/>
+        </w:rPr>
+        <w:t>e Ciencia, Tecnología e Innovación, vigente</w:t>
+      </w:r>
+      <w:r>
+        <w:rPr>
+          <w:rFonts w:ascii="Roboto" w:hAnsi="Roboto"/>
+          <w:sz w:val="22"/>
+          <w:szCs w:val="22"/>
+        </w:rPr>
+        <w:t xml:space="preserve"> en el año 202</w:t>
+      </w:r>
+      <w:r>
+        <w:rPr>
+          <w:rFonts w:ascii="Roboto" w:hAnsi="Roboto"/>
+          <w:sz w:val="22"/>
+          <w:szCs w:val="22"/>
+        </w:rPr>
+        <w:t>4</w:t>
       </w:r>
       <w:r>
         <w:rPr>
@@ -201,125 +224,7 @@
           <w:sz w:val="22"/>
           <w:szCs w:val="22"/>
         </w:rPr>
-        <w:t>delegad</w:t>
-      </w:r>
-      <w:r>
-        <w:rPr>
-          <w:rFonts w:ascii="Roboto" w:hAnsi="Roboto"/>
-          <w:sz w:val="22"/>
-          <w:szCs w:val="22"/>
-        </w:rPr>
-        <w:t>o</w:t>
-      </w:r>
-      <w:r>
-        <w:rPr>
-          <w:rFonts w:ascii="Roboto" w:hAnsi="Roboto"/>
-          <w:sz w:val="22"/>
-          <w:szCs w:val="22"/>
-        </w:rPr>
-        <w:t xml:space="preserve"> para expedir este tipo de certificado</w:t>
-      </w:r>
-      <w:r>
-        <w:rPr>
-          <w:rFonts w:ascii="Roboto" w:hAnsi="Roboto"/>
-          <w:sz w:val="22"/>
-          <w:szCs w:val="22"/>
-        </w:rPr>
-        <w:t>, declara que:</w:t>
-      </w:r>
-    </w:p>
-    <w:p>
-      <w:pPr>
-        <w:jc w:val="both"/>
-        <w:rPr>
-          <w:rFonts w:ascii="Roboto" w:hAnsi="Roboto"/>
-          <w:sz w:val="22"/>
-          <w:szCs w:val="22"/>
-        </w:rPr>
-      </w:pPr>
-    </w:p>
-    <w:p>
-      <w:pPr>
-        <w:jc w:val="both"/>
-        <w:rPr>
-          <w:rFonts w:ascii="Roboto" w:hAnsi="Roboto"/>
-          <w:sz w:val="22"/>
-          <w:szCs w:val="22"/>
-        </w:rPr>
-      </w:pPr>
-    </w:p>
-    <w:p>
-      <w:pPr>
-        <w:jc w:val="both"/>
-        <w:rPr>
-          <w:rFonts w:ascii="Roboto" w:hAnsi="Roboto"/>
-          <w:sz w:val="22"/>
-          <w:szCs w:val="22"/>
-        </w:rPr>
-      </w:pPr>
-      <w:r>
-        <w:rPr>
-          <w:rFonts w:ascii="Roboto" w:hAnsi="Roboto"/>
-          <w:sz w:val="22"/>
-          <w:szCs w:val="22"/>
-        </w:rPr>
-        <w:t xml:space="preserve">Una vez verificado el cumplimiento de los criterios descritos en </w:t>
-      </w:r>
-      <w:r>
-        <w:rPr>
-          <w:rFonts w:ascii="Roboto" w:hAnsi="Roboto"/>
-          <w:sz w:val="22"/>
-          <w:szCs w:val="22"/>
-        </w:rPr>
-        <w:t xml:space="preserve">la Convocatoria Nacional de Actualización y Transición para el Reconocimiento y Medición de Grupos de Investigación, Desarrollo Tecnológico o de Innovación y para el Reconocimiento de Investigadores del Sistema Nacional </w:t>
-      </w:r>
-      <w:r>
-        <w:rPr>
-          <w:rFonts w:ascii="Roboto" w:hAnsi="Roboto"/>
-          <w:sz w:val="22"/>
-          <w:szCs w:val="22"/>
-        </w:rPr>
-        <w:t>d</w:t>
-      </w:r>
-      <w:r>
-        <w:rPr>
-          <w:rFonts w:ascii="Roboto" w:hAnsi="Roboto"/>
-          <w:sz w:val="22"/>
-          <w:szCs w:val="22"/>
-        </w:rPr>
-        <w:t>e Ciencia, Tecnología e Innovación, vigente</w:t>
-      </w:r>
-      <w:r>
-        <w:rPr>
-          <w:rFonts w:ascii="Roboto" w:hAnsi="Roboto"/>
-          <w:sz w:val="22"/>
-          <w:szCs w:val="22"/>
-        </w:rPr>
-        <w:t xml:space="preserve"> en el año 202</w:t>
-      </w:r>
-      <w:r>
-        <w:rPr>
-          <w:rFonts w:ascii="Roboto" w:hAnsi="Roboto"/>
-          <w:sz w:val="22"/>
-          <w:szCs w:val="22"/>
-        </w:rPr>
-        <w:t>4</w:t>
-      </w:r>
-      <w:r>
-        <w:rPr>
-          <w:rFonts w:ascii="Roboto" w:hAnsi="Roboto"/>
-          <w:sz w:val="22"/>
-          <w:szCs w:val="22"/>
-        </w:rPr>
-        <w:t xml:space="preserve">, </w:t>
-      </w:r>
-      <w:r>
-        <w:rPr>
-          <w:rFonts w:ascii="Roboto" w:hAnsi="Roboto"/>
-          <w:sz w:val="22"/>
-          <w:szCs w:val="22"/>
-        </w:rPr>
-        <w:t>y el certificado expedido por la editorial extranjera</w:t>
+        <w:t>y el certificado expedido por la editorial externa</w:t>
       </w:r>
       <w:r>
         <w:rPr>
@@ -430,7 +335,7 @@
                 <w:szCs w:val="20"/>
                 <w:lang w:eastAsia="es-CO"/>
               </w:rPr>
-              <w:t>CAPÏTULO</w:t>
+              <w:t>CAPÍTULO</w:t>
             </w:r>
           </w:p>
         </w:tc>
@@ -449,6 +354,17 @@
                 <w:lang w:eastAsia="es-CO"/>
               </w:rPr>
             </w:pPr>
+            <w:r>
+              <w:rPr>
+                <w:rFonts w:ascii="Roboto" w:eastAsia="Calibri" w:hAnsi="Roboto" w:cs="Calibri"/>
+                <w:bCs/>
+                <w:color w:val="0D0D0D"/>
+                <w:sz w:val="20"/>
+                <w:szCs w:val="20"/>
+                <w:lang w:eastAsia="es-CO"/>
+              </w:rPr>
+              <w:t>{capitulo_titulo}</w:t>
+            </w:r>
           </w:p>
         </w:tc>
       </w:tr>
@@ -500,6 +416,17 @@
                 <w:lang w:eastAsia="es-CO"/>
               </w:rPr>
             </w:pPr>
+            <w:r>
+              <w:rPr>
+                <w:rFonts w:ascii="Roboto" w:eastAsia="Calibri" w:hAnsi="Roboto" w:cs="Calibri"/>
+                <w:bCs/>
+                <w:color w:val="0D0D0D"/>
+                <w:sz w:val="20"/>
+                <w:szCs w:val="20"/>
+                <w:lang w:eastAsia="es-CO"/>
+              </w:rPr>
+              <w:t>{libro_titulo}</w:t>
+            </w:r>
           </w:p>
         </w:tc>
       </w:tr>
@@ -551,6 +478,17 @@
                 <w:lang w:eastAsia="es-CO"/>
               </w:rPr>
             </w:pPr>
+            <w:r>
+              <w:rPr>
+                <w:rFonts w:ascii="Roboto" w:eastAsia="Calibri" w:hAnsi="Roboto" w:cs="Calibri"/>
+                <w:bCs/>
+                <w:color w:val="0D0D0D"/>
+                <w:sz w:val="20"/>
+                <w:szCs w:val="20"/>
+                <w:lang w:eastAsia="es-CO"/>
+              </w:rPr>
+              <w:t>{paginas}</w:t>
+            </w:r>
           </w:p>
         </w:tc>
       </w:tr>
@@ -601,6 +539,17 @@
                 <w:lang w:eastAsia="es-CO"/>
               </w:rPr>
             </w:pPr>
+            <w:r>
+              <w:rPr>
+                <w:rFonts w:ascii="Roboto" w:eastAsia="Calibri" w:hAnsi="Roboto" w:cs="Calibri"/>
+                <w:bCs/>
+                <w:color w:val="0D0D0D"/>
+                <w:sz w:val="20"/>
+                <w:szCs w:val="20"/>
+                <w:lang w:eastAsia="es-CO"/>
+              </w:rPr>
+              <w:t>{isbn_digital}{#isbn_impreso} / {isbn_impreso}{/isbn_impreso}{^isbn_digital}{isbn_impreso}{/isbn_digital}</w:t>
+            </w:r>
           </w:p>
         </w:tc>
       </w:tr>
@@ -651,6 +600,17 @@
                 <w:lang w:eastAsia="es-CO"/>
               </w:rPr>
             </w:pPr>
+            <w:r>
+              <w:rPr>
+                <w:rFonts w:ascii="Roboto" w:eastAsia="Calibri" w:hAnsi="Roboto" w:cs="Calibri"/>
+                <w:bCs/>
+                <w:color w:val="0D0D0D"/>
+                <w:sz w:val="20"/>
+                <w:szCs w:val="20"/>
+                <w:lang w:eastAsia="es-CO"/>
+              </w:rPr>
+              <w:t>{autores}</w:t>
+            </w:r>
           </w:p>
         </w:tc>
       </w:tr>
@@ -696,17 +656,7 @@
                 <w:szCs w:val="20"/>
                 <w:lang w:eastAsia="es-CO"/>
               </w:rPr>
-              <w:t>P</w:t>
-            </w:r>
-            <w:r>
-              <w:rPr>
-                <w:rFonts w:ascii="Roboto" w:eastAsia="Calibri" w:hAnsi="Roboto" w:cs="Calibri"/>
-                <w:b/>
-                <w:sz w:val="20"/>
-                <w:szCs w:val="20"/>
-                <w:lang w:eastAsia="es-CO"/>
-              </w:rPr>
-              <w:t>UBLICACIÓN</w:t>
+              <w:t>PUBLICACIÓN</w:t>
             </w:r>
           </w:p>
         </w:tc>
@@ -725,6 +675,17 @@
                 <w:lang w:eastAsia="es-CO"/>
               </w:rPr>
             </w:pPr>
+            <w:r>
+              <w:rPr>
+                <w:rFonts w:ascii="Roboto" w:eastAsia="Calibri" w:hAnsi="Roboto" w:cs="Calibri"/>
+                <w:bCs/>
+                <w:color w:val="0D0D0D"/>
+                <w:sz w:val="20"/>
+                <w:szCs w:val="20"/>
+                <w:lang w:eastAsia="es-CO"/>
+              </w:rPr>
+              <w:t>{ciudad}, {mes_publicacion} de {anio_publicacion}</w:t>
+            </w:r>
           </w:p>
         </w:tc>
       </w:tr>
@@ -775,6 +736,16 @@
                 <w:lang w:eastAsia="es-CO"/>
               </w:rPr>
             </w:pPr>
+            <w:r>
+              <w:rPr>
+                <w:rFonts w:ascii="Roboto" w:eastAsia="Calibri" w:hAnsi="Roboto" w:cs="Calibri"/>
+                <w:color w:val="0D0D0D"/>
+                <w:sz w:val="20"/>
+                <w:szCs w:val="20"/>
+                <w:lang w:eastAsia="es-CO"/>
+              </w:rPr>
+              <w:t>{editorial}</w:t>
+            </w:r>
           </w:p>
         </w:tc>
       </w:tr>
@@ -823,6 +794,16 @@
                 <w:lang w:eastAsia="es-CO"/>
               </w:rPr>
             </w:pPr>
+            <w:r>
+              <w:rPr>
+                <w:rFonts w:ascii="Roboto" w:eastAsia="Calibri" w:hAnsi="Roboto" w:cs="Calibri"/>
+                <w:color w:val="0D0D0D"/>
+                <w:sz w:val="20"/>
+                <w:szCs w:val="20"/>
+                <w:lang w:eastAsia="es-CO"/>
+              </w:rPr>
+              <w:t>{medio_divulgacion}{enlace_repositorio}</w:t>
+            </w:r>
           </w:p>
         </w:tc>
       </w:tr>
@@ -1115,7 +1096,7 @@
       <w:headerReference w:type="default" r:id="rId9"/>
       <w:footerReference w:type="default" r:id="rId10"/>
       <w:pgSz w:w="12240" w:h="15840"/>
-      <w:pgMar w:top="1418" w:right="1701" w:bottom="1418" w:left="1701" w:header="709" w:footer="709" w:gutter="0"/>
+      <w:pgMar w:top="1417" w:right="1701" w:bottom="1417" w:left="1701" w:header="708" w:footer="708" w:gutter="0"/>
       <w:pgNumType w:start="1"/>
       <w:cols w:space="720"/>
     </w:sectPr>
@@ -1241,7 +1222,7 @@
 </file>
 
 <file path=word/header1.xml><?xml version="1.0" encoding="utf-8"?>
-<w:hdr xmlns:wpc="http://schemas.microsoft.com/office/word/2010/wordprocessingCanvas" xmlns:cx="http://schemas.microsoft.com/office/drawing/2014/chartex" xmlns:cx1="http://schemas.microsoft.com/office/drawing/2015/9/8/chartex" xmlns:cx2="http://schemas.microsoft.com/office/drawing/2015/10/21/chartex" xmlns:cx3="http://schemas.microsoft.com/office/drawing/2016/5/9/chartex" xmlns:cx4="http://schemas.microsoft.com/office/drawing/2016/5/10/chartex" xmlns:cx5="http://schemas.microsoft.com/office/drawing/2016/5/11/chartex" xmlns:cx6="http://schemas.microsoft.com/office/drawing/2016/5/12/chartex" xmlns:cx7="http://schemas.microsoft.com/office/drawing/2016/5/13/chartex" xmlns:cx8="http://schemas.microsoft.com/office/drawing/2016/5/14/chartex" xmlns:mc="http://schemas.openxmlformats.org/markup-compatibility/2006" xmlns:aink="http://schemas.microsoft.com/office/drawing/2016/ink" xmlns:am3d="http://schemas.microsoft.com/office/drawing/2017/model3d" xmlns:o="urn:schemas-microsoft-com:office:office" xmlns:oel="http://schemas.microsoft.com/office/2019/extlst" xmlns:r="http://schemas.openxmlformats.org/officeDocument/2006/relationships" xmlns:m="http://schemas.openxmlformats.org/officeDocument/2006/math" xmlns:v="urn:schemas-microsoft-com:vml" xmlns:wp14="http://schemas.microsoft.com/office/word/2010/wordprocessingDrawing" xmlns:wp="http://schemas.openxmlformats.org/drawingml/2006/wordprocessingDrawing" xmlns:w10="urn:schemas-microsoft-com:office:word" xmlns:w="http://schemas.openxmlformats.org/wordprocessingml/2006/main" xmlns:w14="http://schemas.microsoft.com/office/word/2010/wordml" xmlns:w15="http://schemas.microsoft.com/office/word/2012/wordml" xmlns:w16cex="http://schemas.microsoft.com/office/word/2018/wordml/cex" xmlns:w16cid="http://schemas.microsoft.com/office/word/2016/wordml/cid" xmlns:w16="http://schemas.microsoft.com/office/word/2018/wordml" xmlns:w16du="http://schemas.microsoft.com/office/word/2023/wordml/word16du" xmlns:w16sdtdh="http://schemas.microsoft.com/office/word/2020/wordml/sdtdatahash" xmlns:w16se="http://schemas.microsoft.com/office/word/2015/wordml/symex" xmlns:wpg="http://schemas.microsoft.com/office/word/2010/wordprocessingGroup" xmlns:wpi="http://schemas.microsoft.com/office/word/2010/wordprocessingInk" xmlns:wne="http://schemas.microsoft.com/office/word/2006/wordml" xmlns:wps="http://schemas.microsoft.com/office/word/2010/wordprocessingShape" mc:Ignorable="w14 w15 w16se w16cid w16 w16cex w16sdtdh w16du wp14">
+<w:hdr xmlns:wpc="http://schemas.microsoft.com/office/word/2010/wordprocessingCanvas" xmlns:cx="http://schemas.microsoft.com/office/drawing/2014/chartex" xmlns:cx1="http://schemas.microsoft.com/office/drawing/2015/9/8/chartex" xmlns:cx2="http://schemas.microsoft.com/office/drawing/2015/10/21/chartex" xmlns:cx3="http://schemas.microsoft.com/office/drawing/2016/5/9/chartex" xmlns:cx4="http://schemas.microsoft.com/office/drawing/2016/5/10/chartex" xmlns:cx5="http://schemas.microsoft.com/office/drawing/2016/5/11/chartex" xmlns:cx6="http://schemas.microsoft.com/office/drawing/2016/5/12/chartex" xmlns:cx7="http://schemas.microsoft.com/office/drawing/2016/5/13/chartex" xmlns:cx8="http://schemas.microsoft.com/office/drawing/2016/5/14/chartex" xmlns:mc="http://schemas.openxmlformats.org/markup-compatibility/2006" xmlns:aink="http://schemas.microsoft.com/office/drawing/2016/ink" xmlns:am3d="http://schemas.microsoft.com/office/drawing/2017/model3d" xmlns:o="urn:schemas-microsoft-com:office:office" xmlns:oel="http://schemas.microsoft.com/office/2019/extlst" xmlns:r="http://schemas.openxmlformats.org/officeDocument/2006/relationships" xmlns:m="http://schemas.openxmlformats.org/officeDocument/2006/math" xmlns:v="urn:schemas-microsoft-com:vml" xmlns:wp14="http://schemas.microsoft.com/office/word/2010/wordprocessingDrawing" xmlns:wp="http://schemas.openxmlformats.org/drawingml/2006/wordprocessingDrawing" xmlns:w10="urn:schemas-microsoft-com:office:word" xmlns:w="http://schemas.openxmlformats.org/wordprocessingml/2006/main" xmlns:w14="http://schemas.microsoft.com/office/word/2010/wordml" xmlns:w15="http://schemas.microsoft.com/office/word/2012/wordml" xmlns:w16cex="http://schemas.microsoft.com/office/word/2018/wordml/cex" xmlns:w16cid="http://schemas.microsoft.com/office/word/2016/wordml/cid" xmlns:w16="http://schemas.microsoft.com/office/word/2018/wordml" xmlns:w16du="http://schemas.microsoft.com/office/word/2023/wordml/word16du" xmlns:w16sdtdh="http://schemas.microsoft.com/office/word/2020/wordml/sdtdatahash" xmlns:w16sdtfl="http://schemas.microsoft.com/office/word/2024/wordml/sdtformatlock" xmlns:w16se="http://schemas.microsoft.com/office/word/2015/wordml/symex" xmlns:wpg="http://schemas.microsoft.com/office/word/2010/wordprocessingGroup" xmlns:wpi="http://schemas.microsoft.com/office/word/2010/wordprocessingInk" xmlns:wne="http://schemas.microsoft.com/office/word/2006/wordml" xmlns:wps="http://schemas.microsoft.com/office/word/2010/wordprocessingShape" mc:Ignorable="w14 w15 w16se w16cid w16 w16cex w16sdtdh w16sdtfl w16du wp14">
   <w:p>
     <w:pPr>
       <w:pStyle w:val="Encabezado"/>
@@ -1249,140 +1230,32 @@
     <w:r>
       <w:rPr>
         <w:noProof/>
-        <w:bdr w:val="none" w:sz="0" w:space="0" w:color="auto" w:frame="1"/>
-        <w:lang w:val="es-CO" w:eastAsia="es-CO"/>
-      </w:rPr>
-      <w:drawing>
-        <wp:anchor distT="0" distB="0" distL="114300" distR="114300" simplePos="0" relativeHeight="251661312" behindDoc="1" locked="0" layoutInCell="1" allowOverlap="1" wp14:anchorId="74149F5A" wp14:editId="390EEA46">
-          <wp:simplePos x="0" y="0"/>
-          <wp:positionH relativeFrom="column">
-            <wp:posOffset>104775</wp:posOffset>
-          </wp:positionH>
-          <wp:positionV relativeFrom="paragraph">
-            <wp:posOffset>1580515</wp:posOffset>
-          </wp:positionV>
-          <wp:extent cx="5344795" cy="5326380"/>
-          <wp:effectExtent l="0" t="0" r="0" b="0"/>
-          <wp:wrapNone/>
-          <wp:docPr id="6" name="Imagen 6" descr="https://lh6.googleusercontent.com/BZml38J4zB4aygz-ObHtIrfkEhGTztv-jr6QJQkzfiZv43f9HGt_VDXtmTKu72rC12TGnpOAhqgkO75t20TPacIgeC5PWSDq-pi3ORYrWSoufM8JTmAx0MMK0iFRjH4EaSLzuV4"/>
-          <wp:cNvGraphicFramePr>
-            <a:graphicFrameLocks xmlns:a="http://schemas.openxmlformats.org/drawingml/2006/main" noChangeAspect="1"/>
-          </wp:cNvGraphicFramePr>
-          <a:graphic xmlns:a="http://schemas.openxmlformats.org/drawingml/2006/main">
-            <a:graphicData uri="http://schemas.openxmlformats.org/drawingml/2006/picture">
-              <pic:pic xmlns:pic="http://schemas.openxmlformats.org/drawingml/2006/picture">
-                <pic:nvPicPr>
-                  <pic:cNvPr id="0" name="Picture 3" descr="https://lh6.googleusercontent.com/BZml38J4zB4aygz-ObHtIrfkEhGTztv-jr6QJQkzfiZv43f9HGt_VDXtmTKu72rC12TGnpOAhqgkO75t20TPacIgeC5PWSDq-pi3ORYrWSoufM8JTmAx0MMK0iFRjH4EaSLzuV4"/>
-                  <pic:cNvPicPr>
-                    <a:picLocks noChangeAspect="1" noChangeArrowheads="1"/>
-                  </pic:cNvPicPr>
-                </pic:nvPicPr>
-                <pic:blipFill>
-                  <a:blip r:embed="rId1" cstate="print">
-                    <a:extLst>
-                      <a:ext uri="{28A0092B-C50C-407E-A947-70E740481C1C}">
-                        <a14:useLocalDpi xmlns:a14="http://schemas.microsoft.com/office/drawing/2010/main" val="0"/>
-                      </a:ext>
-                    </a:extLst>
-                  </a:blip>
-                  <a:srcRect/>
-                  <a:stretch>
-                    <a:fillRect/>
-                  </a:stretch>
-                </pic:blipFill>
-                <pic:spPr bwMode="auto">
-                  <a:xfrm>
-                    <a:off x="0" y="0"/>
-                    <a:ext cx="5344795" cy="5326380"/>
-                  </a:xfrm>
-                  <a:prstGeom prst="rect">
-                    <a:avLst/>
-                  </a:prstGeom>
-                  <a:noFill/>
-                  <a:ln>
-                    <a:noFill/>
-                  </a:ln>
-                </pic:spPr>
-              </pic:pic>
-            </a:graphicData>
-          </a:graphic>
-          <wp14:sizeRelH relativeFrom="page">
-            <wp14:pctWidth>0</wp14:pctWidth>
-          </wp14:sizeRelH>
-          <wp14:sizeRelV relativeFrom="page">
-            <wp14:pctHeight>0</wp14:pctHeight>
-          </wp14:sizeRelV>
-        </wp:anchor>
-      </w:drawing>
-    </w:r>
-    <w:r>
-      <w:rPr>
-        <w:noProof/>
-        <w:bdr w:val="none" w:sz="0" w:space="0" w:color="auto" w:frame="1"/>
-        <w:lang w:val="es-CO" w:eastAsia="es-CO"/>
-      </w:rPr>
-      <w:drawing>
-        <wp:anchor distT="0" distB="0" distL="114300" distR="114300" simplePos="0" relativeHeight="251658240" behindDoc="0" locked="0" layoutInCell="1" allowOverlap="1" wp14:anchorId="08D66998" wp14:editId="774440DE">
-          <wp:simplePos x="0" y="0"/>
-          <wp:positionH relativeFrom="column">
-            <wp:posOffset>-548542</wp:posOffset>
-          </wp:positionH>
-          <wp:positionV relativeFrom="paragraph">
-            <wp:posOffset>-268605</wp:posOffset>
-          </wp:positionV>
-          <wp:extent cx="6691548" cy="874006"/>
-          <wp:effectExtent l="0" t="0" r="0" b="0"/>
-          <wp:wrapNone/>
-          <wp:docPr id="5" name="Imagen 5" descr="https://lh3.googleusercontent.com/RHDTdCJKkD4Ojk-Ls0eHCmHX6nYK8_mWjfHzh_qmBFmxzqXuMxNjk1do7Q8_kF3W5NvdjvLrXKM3gXGS1bwSgCwr8QRBteW-56XjEizZX5I0gLWCubRfo9PWHO7LNIQeKU0pj0A"/>
-          <wp:cNvGraphicFramePr>
-            <a:graphicFrameLocks xmlns:a="http://schemas.openxmlformats.org/drawingml/2006/main" noChangeAspect="1"/>
-          </wp:cNvGraphicFramePr>
-          <a:graphic xmlns:a="http://schemas.openxmlformats.org/drawingml/2006/main">
-            <a:graphicData uri="http://schemas.openxmlformats.org/drawingml/2006/picture">
-              <pic:pic xmlns:pic="http://schemas.openxmlformats.org/drawingml/2006/picture">
-                <pic:nvPicPr>
-                  <pic:cNvPr id="0" name="Picture 1" descr="https://lh3.googleusercontent.com/RHDTdCJKkD4Ojk-Ls0eHCmHX6nYK8_mWjfHzh_qmBFmxzqXuMxNjk1do7Q8_kF3W5NvdjvLrXKM3gXGS1bwSgCwr8QRBteW-56XjEizZX5I0gLWCubRfo9PWHO7LNIQeKU0pj0A"/>
-                  <pic:cNvPicPr>
-                    <a:picLocks noChangeAspect="1" noChangeArrowheads="1"/>
-                  </pic:cNvPicPr>
-                </pic:nvPicPr>
-                <pic:blipFill>
-                  <a:blip r:embed="rId2">
-                    <a:extLst>
-                      <a:ext uri="{28A0092B-C50C-407E-A947-70E740481C1C}">
-                        <a14:useLocalDpi xmlns:a14="http://schemas.microsoft.com/office/drawing/2010/main" val="0"/>
-                      </a:ext>
-                    </a:extLst>
-                  </a:blip>
-                  <a:srcRect/>
-                  <a:stretch>
-                    <a:fillRect/>
-                  </a:stretch>
-                </pic:blipFill>
-                <pic:spPr bwMode="auto">
-                  <a:xfrm>
-                    <a:off x="0" y="0"/>
-                    <a:ext cx="6691548" cy="874006"/>
-                  </a:xfrm>
-                  <a:prstGeom prst="rect">
-                    <a:avLst/>
-                  </a:prstGeom>
-                  <a:noFill/>
-                  <a:ln>
-                    <a:noFill/>
-                  </a:ln>
-                </pic:spPr>
-              </pic:pic>
-            </a:graphicData>
-          </a:graphic>
-          <wp14:sizeRelH relativeFrom="page">
-            <wp14:pctWidth>0</wp14:pctWidth>
-          </wp14:sizeRelH>
-          <wp14:sizeRelV relativeFrom="page">
-            <wp14:pctHeight>0</wp14:pctHeight>
-          </wp14:sizeRelV>
-        </wp:anchor>
-      </w:drawing>
+      </w:rPr>
+      <w:pict w14:anchorId="1097904B">
+        <v:shapetype id="_x0000_t75" coordsize="21600,21600" o:spt="75" o:preferrelative="t" path="m@4@5l@4@11@9@11@9@5xe" filled="f" stroked="f">
+          <v:stroke joinstyle="miter"/>
+          <v:formulas>
+            <v:f eqn="if lineDrawn pixelLineWidth 0"/>
+            <v:f eqn="sum @0 1 0"/>
+            <v:f eqn="sum 0 0 @1"/>
+            <v:f eqn="prod @2 1 2"/>
+            <v:f eqn="prod @3 21600 pixelWidth"/>
+            <v:f eqn="prod @3 21600 pixelHeight"/>
+            <v:f eqn="sum @0 0 1"/>
+            <v:f eqn="prod @6 1 2"/>
+            <v:f eqn="prod @7 21600 pixelWidth"/>
+            <v:f eqn="sum @8 21600 0"/>
+            <v:f eqn="prod @7 21600 pixelHeight"/>
+            <v:f eqn="sum @10 21600 0"/>
+          </v:formulas>
+          <v:path o:extrusionok="f" gradientshapeok="t" o:connecttype="rect"/>
+          <o:lock v:ext="edit" aspectratio="t"/>
+        </v:shapetype>
+        <v:shape id="WordPictureWatermark350198205" o:spid="_x0000_s1025" type="#_x0000_t75" style="position:absolute;margin-left:-84.45pt;margin-top:-65.95pt;width:612pt;height:11in;z-index:-251658240;mso-position-horizontal-relative:margin;mso-position-vertical-relative:margin" o:allowincell="f">
+          <v:imagedata r:id="rId1" o:title="2021 - UNISIMON hoja membreteada-01"/>
+          <w10:wrap anchorx="margin" anchory="margin"/>
+        </v:shape>
+      </w:pict>
     </w:r>
   </w:p>
 </w:hdr>

</xml_diff>